<commit_message>
Update Mou retrieval task questions
</commit_message>
<xml_diff>
--- a/2 information retrieval tasks questions/2_information_retrieval_tasks_questions_mou.docx
+++ b/2 information retrieval tasks questions/2_information_retrieval_tasks_questions_mou.docx
@@ -192,8 +192,6 @@
         </w:rPr>
         <w:br w:type="textWrapping"/>
       </w:r>
-      <w:bookmarkStart w:id="0" w:name="_GoBack"/>
-      <w:bookmarkEnd w:id="0"/>
       <w:r>
         <w:rPr>
           <w:b w:val="0"/>
@@ -860,6 +858,29 @@
           <w:b w:val="0"/>
           <w:bCs w:val="0"/>
         </w:rPr>
+        <w:t>：1990 年前后。</w:t>
+      </w:r>
+    </w:p>
+    <w:p>
+      <w:pPr>
+        <w:rPr>
+          <w:b w:val="0"/>
+          <w:bCs w:val="0"/>
+        </w:rPr>
+      </w:pPr>
+      <w:r>
+        <w:rPr>
+          <w:rStyle w:val="5"/>
+          <w:b w:val="0"/>
+          <w:bCs w:val="0"/>
+        </w:rPr>
+        <w:t>标准答案要点</w:t>
+      </w:r>
+      <w:r>
+        <w:rPr>
+          <w:b w:val="0"/>
+          <w:bCs w:val="0"/>
+        </w:rPr>
         <w:t>：正高级。</w:t>
       </w:r>
       <w:r>
@@ -905,7 +926,7 @@
           <w:b w:val="0"/>
           <w:bCs w:val="0"/>
         </w:rPr>
-        <w:t>：1990 年前后。</w:t>
+        <w:t>：香港、澳门。</w:t>
       </w:r>
     </w:p>
     <w:p>
@@ -928,7 +949,7 @@
           <w:b w:val="0"/>
           <w:bCs w:val="0"/>
         </w:rPr>
-        <w:t>：香港、澳门。</w:t>
+        <w:t>：2004 年前后；正好赶上海啸那年。</w:t>
       </w:r>
     </w:p>
     <w:p>
@@ -951,30 +972,16 @@
           <w:b w:val="0"/>
           <w:bCs w:val="0"/>
         </w:rPr>
-        <w:t>：2004 年前后；正好赶上海啸那年。</w:t>
-      </w:r>
-    </w:p>
-    <w:p>
-      <w:pPr>
-        <w:rPr>
-          <w:b w:val="0"/>
-          <w:bCs w:val="0"/>
-        </w:rPr>
-      </w:pPr>
-      <w:r>
-        <w:rPr>
-          <w:rStyle w:val="5"/>
-          <w:b w:val="0"/>
-          <w:bCs w:val="0"/>
-        </w:rPr>
-        <w:t>标准答案要点</w:t>
-      </w:r>
-      <w:r>
-        <w:rPr>
-          <w:b w:val="0"/>
-          <w:bCs w:val="0"/>
-        </w:rPr>
-        <w:t>：一夜 6 台；从傍晚 6 点接班一直到次日早上 9 点多。</w:t>
+        <w:t>：一夜 6 台；从傍晚 6 点接班一直</w:t>
+      </w:r>
+      <w:bookmarkStart w:id="0" w:name="_GoBack"/>
+      <w:bookmarkEnd w:id="0"/>
+      <w:r>
+        <w:rPr>
+          <w:b w:val="0"/>
+          <w:bCs w:val="0"/>
+        </w:rPr>
+        <w:t>到次日早上 9 点多。</w:t>
       </w:r>
     </w:p>
     <w:sectPr>

</xml_diff>